<commit_message>
Updated Admin pdf and dox, created state diagrams
</commit_message>
<xml_diff>
--- a/User Stories and Use Cases/Admin/Admin_Complete_Spec.docx
+++ b/User Stories and Use Cases/Admin/Admin_Complete_Spec.docx
@@ -20324,7 +20324,7 @@
           <w:noProof/>
         </w:rPr>
         <w:drawing>
-          <wp:inline distT="0" distB="0" distL="0" distR="0" wp14:anchorId="01D4475C" wp14:editId="35421A8A">
+          <wp:inline distT="0" distB="0" distL="0" distR="0" wp14:anchorId="7D364760" wp14:editId="2857D2C1">
             <wp:extent cx="4068305" cy="6518140"/>
             <wp:effectExtent l="0" t="0" r="8890" b="0"/>
             <wp:docPr id="312481256" name="Picture 26"/>
@@ -20573,20 +20573,12 @@
         <w:pStyle w:val="Heading2"/>
         <w:spacing w:before="300" w:after="160"/>
       </w:pPr>
-      <w:proofErr w:type="gramStart"/>
       <w:r>
         <w:rPr>
           <w:color w:val="1B4F72"/>
         </w:rPr>
         <w:lastRenderedPageBreak/>
-        <w:t>9.1  UC</w:t>
-      </w:r>
-      <w:proofErr w:type="gramEnd"/>
-      <w:r>
-        <w:rPr>
-          <w:color w:val="1B4F72"/>
-        </w:rPr>
-        <w:t>_A01: Register New Patient</w:t>
+        <w:t>9.1  UC_A01: Register New Patient</w:t>
       </w:r>
     </w:p>
     <w:p>
@@ -20615,7 +20607,7 @@
           <w:noProof/>
         </w:rPr>
         <w:drawing>
-          <wp:inline distT="0" distB="0" distL="0" distR="0" wp14:anchorId="35593712" wp14:editId="4FCDE30B">
+          <wp:inline distT="0" distB="0" distL="0" distR="0" wp14:anchorId="6138F5F1" wp14:editId="613FF803">
             <wp:extent cx="5941060" cy="6237605"/>
             <wp:effectExtent l="0" t="0" r="2540" b="0"/>
             <wp:docPr id="1577105030" name="Picture 18"/>
@@ -20696,20 +20688,12 @@
         <w:pStyle w:val="Heading2"/>
         <w:spacing w:before="300" w:after="160"/>
       </w:pPr>
-      <w:proofErr w:type="gramStart"/>
       <w:r>
         <w:rPr>
           <w:color w:val="1B4F72"/>
         </w:rPr>
         <w:lastRenderedPageBreak/>
-        <w:t>9.2  UC</w:t>
-      </w:r>
-      <w:proofErr w:type="gramEnd"/>
-      <w:r>
-        <w:rPr>
-          <w:color w:val="1B4F72"/>
-        </w:rPr>
-        <w:t>_A02: Assign Room to Appointment</w:t>
+        <w:t>9.2  UC_A02: Assign Room to Appointment</w:t>
       </w:r>
     </w:p>
     <w:p>
@@ -20738,7 +20722,7 @@
           <w:noProof/>
         </w:rPr>
         <w:drawing>
-          <wp:inline distT="0" distB="0" distL="0" distR="0" wp14:anchorId="3EFD2653" wp14:editId="08B000BC">
+          <wp:inline distT="0" distB="0" distL="0" distR="0" wp14:anchorId="6E1A86A5" wp14:editId="0AAC55F1">
             <wp:extent cx="5158694" cy="7245458"/>
             <wp:effectExtent l="0" t="0" r="4445" b="0"/>
             <wp:docPr id="208453469" name="Picture 19"/>
@@ -20798,20 +20782,12 @@
         <w:pStyle w:val="Heading2"/>
         <w:spacing w:before="300" w:after="160"/>
       </w:pPr>
-      <w:proofErr w:type="gramStart"/>
       <w:r>
         <w:rPr>
           <w:color w:val="1B4F72"/>
         </w:rPr>
         <w:lastRenderedPageBreak/>
-        <w:t>9.3  UC</w:t>
-      </w:r>
-      <w:proofErr w:type="gramEnd"/>
-      <w:r>
-        <w:rPr>
-          <w:color w:val="1B4F72"/>
-        </w:rPr>
-        <w:t>_A03: Generate Patient Bill</w:t>
+        <w:t>9.3  UC_A03: Generate Patient Bill</w:t>
       </w:r>
     </w:p>
     <w:p>
@@ -20840,7 +20816,7 @@
           <w:noProof/>
         </w:rPr>
         <w:drawing>
-          <wp:inline distT="0" distB="0" distL="0" distR="0" wp14:anchorId="3D95963A" wp14:editId="504B86D8">
+          <wp:inline distT="0" distB="0" distL="0" distR="0" wp14:anchorId="1069A48B" wp14:editId="3FDA1F7E">
             <wp:extent cx="4972548" cy="7231174"/>
             <wp:effectExtent l="0" t="0" r="0" b="8255"/>
             <wp:docPr id="1532695902" name="Picture 20"/>
@@ -20900,20 +20876,12 @@
         <w:pStyle w:val="Heading2"/>
         <w:spacing w:before="300" w:after="160"/>
       </w:pPr>
-      <w:proofErr w:type="gramStart"/>
       <w:r>
         <w:rPr>
           <w:color w:val="1B4F72"/>
         </w:rPr>
         <w:lastRenderedPageBreak/>
-        <w:t>9.4  UC</w:t>
-      </w:r>
-      <w:proofErr w:type="gramEnd"/>
-      <w:r>
-        <w:rPr>
-          <w:color w:val="1B4F72"/>
-        </w:rPr>
-        <w:t>_A04: Manage Doctors (Add / Update / Deactivate)</w:t>
+        <w:t>9.4  UC_A04: Manage Doctors (Add / Update / Deactivate)</w:t>
       </w:r>
     </w:p>
     <w:p>
@@ -20935,17 +20903,16 @@
     <w:p>
       <w:pPr>
         <w:spacing w:after="200"/>
-        <w:jc w:val="center"/>
       </w:pPr>
       <w:r>
         <w:rPr>
           <w:noProof/>
         </w:rPr>
         <w:drawing>
-          <wp:inline distT="0" distB="0" distL="0" distR="0" wp14:anchorId="7E6BE827" wp14:editId="43BB6F1C">
-            <wp:extent cx="5941060" cy="4255770"/>
-            <wp:effectExtent l="0" t="0" r="2540" b="0"/>
-            <wp:docPr id="108636731" name="Picture 21"/>
+          <wp:inline distT="0" distB="0" distL="0" distR="0" wp14:anchorId="1E41AD12" wp14:editId="2D581CDB">
+            <wp:extent cx="6013995" cy="3766457"/>
+            <wp:effectExtent l="0" t="0" r="6350" b="5715"/>
+            <wp:docPr id="617683601" name="Picture 1"/>
             <wp:cNvGraphicFramePr>
               <a:graphicFrameLocks xmlns:a="http://schemas.openxmlformats.org/drawingml/2006/main" noChangeAspect="1"/>
             </wp:cNvGraphicFramePr>
@@ -20953,7 +20920,7 @@
               <a:graphicData uri="http://schemas.openxmlformats.org/drawingml/2006/picture">
                 <pic:pic xmlns:pic="http://schemas.openxmlformats.org/drawingml/2006/picture">
                   <pic:nvPicPr>
-                    <pic:cNvPr id="0" name="Picture 21"/>
+                    <pic:cNvPr id="0" name="Picture 1"/>
                     <pic:cNvPicPr>
                       <a:picLocks noChangeAspect="1" noChangeArrowheads="1"/>
                     </pic:cNvPicPr>
@@ -20974,7 +20941,7 @@
                   <pic:spPr bwMode="auto">
                     <a:xfrm>
                       <a:off x="0" y="0"/>
-                      <a:ext cx="5941060" cy="4255770"/>
+                      <a:ext cx="6024219" cy="3772860"/>
                     </a:xfrm>
                     <a:prstGeom prst="rect">
                       <a:avLst/>
@@ -21076,21 +21043,22 @@
       <w:pPr>
         <w:pStyle w:val="Heading2"/>
         <w:spacing w:before="300" w:after="160"/>
-      </w:pPr>
-      <w:proofErr w:type="gramStart"/>
-      <w:r>
         <w:rPr>
           <w:color w:val="1B4F72"/>
         </w:rPr>
+      </w:pPr>
+    </w:p>
+    <w:p>
+      <w:pPr>
+        <w:pStyle w:val="Heading2"/>
+        <w:spacing w:before="300" w:after="160"/>
+      </w:pPr>
+      <w:r>
+        <w:rPr>
+          <w:color w:val="1B4F72"/>
+        </w:rPr>
         <w:lastRenderedPageBreak/>
-        <w:t>9.5  UC</w:t>
-      </w:r>
-      <w:proofErr w:type="gramEnd"/>
-      <w:r>
-        <w:rPr>
-          <w:color w:val="1B4F72"/>
-        </w:rPr>
-        <w:t>_A05: Manage Service Catalog and Prices</w:t>
+        <w:t>9.5  UC_A05: Manage Service Catalog and Prices</w:t>
       </w:r>
     </w:p>
     <w:p>
@@ -21119,7 +21087,7 @@
           <w:noProof/>
         </w:rPr>
         <w:drawing>
-          <wp:inline distT="0" distB="0" distL="0" distR="0" wp14:anchorId="79791AC2" wp14:editId="46858699">
+          <wp:inline distT="0" distB="0" distL="0" distR="0" wp14:anchorId="508808FE" wp14:editId="0DCDDE67">
             <wp:extent cx="6021092" cy="4592468"/>
             <wp:effectExtent l="0" t="0" r="0" b="0"/>
             <wp:docPr id="1071526357" name="Picture 22"/>
@@ -21245,20 +21213,12 @@
         <w:pStyle w:val="Heading2"/>
         <w:spacing w:before="300" w:after="160"/>
       </w:pPr>
-      <w:proofErr w:type="gramStart"/>
       <w:r>
         <w:rPr>
           <w:color w:val="1B4F72"/>
         </w:rPr>
         <w:lastRenderedPageBreak/>
-        <w:t>9.6  UC</w:t>
-      </w:r>
-      <w:proofErr w:type="gramEnd"/>
-      <w:r>
-        <w:rPr>
-          <w:color w:val="1B4F72"/>
-        </w:rPr>
-        <w:t>_A06: Manage Appointment Schedules</w:t>
+        <w:t>9.6  UC_A06: Manage Appointment Schedules</w:t>
       </w:r>
     </w:p>
     <w:p>
@@ -21287,10 +21247,10 @@
           <w:noProof/>
         </w:rPr>
         <w:drawing>
-          <wp:inline distT="0" distB="0" distL="0" distR="0" wp14:anchorId="298ABF33" wp14:editId="1FDE9D30">
-            <wp:extent cx="5935980" cy="4749800"/>
-            <wp:effectExtent l="0" t="0" r="7620" b="0"/>
-            <wp:docPr id="1663080033" name="Picture 23"/>
+          <wp:inline distT="0" distB="0" distL="0" distR="0" wp14:anchorId="663104D6" wp14:editId="7EEEE1C4">
+            <wp:extent cx="6115069" cy="4027714"/>
+            <wp:effectExtent l="0" t="0" r="0" b="0"/>
+            <wp:docPr id="1222366360" name="Picture 2"/>
             <wp:cNvGraphicFramePr>
               <a:graphicFrameLocks xmlns:a="http://schemas.openxmlformats.org/drawingml/2006/main" noChangeAspect="1"/>
             </wp:cNvGraphicFramePr>
@@ -21298,7 +21258,7 @@
               <a:graphicData uri="http://schemas.openxmlformats.org/drawingml/2006/picture">
                 <pic:pic xmlns:pic="http://schemas.openxmlformats.org/drawingml/2006/picture">
                   <pic:nvPicPr>
-                    <pic:cNvPr id="0" name="Picture 23"/>
+                    <pic:cNvPr id="0" name="Picture 3"/>
                     <pic:cNvPicPr>
                       <a:picLocks noChangeAspect="1" noChangeArrowheads="1"/>
                     </pic:cNvPicPr>
@@ -21319,7 +21279,7 @@
                   <pic:spPr bwMode="auto">
                     <a:xfrm>
                       <a:off x="0" y="0"/>
-                      <a:ext cx="5935980" cy="4749800"/>
+                      <a:ext cx="6122617" cy="4032686"/>
                     </a:xfrm>
                     <a:prstGeom prst="rect">
                       <a:avLst/>
@@ -21338,6 +21298,24 @@
     </w:p>
     <w:p>
       <w:pPr>
+        <w:spacing w:after="200"/>
+        <w:jc w:val="center"/>
+      </w:pPr>
+    </w:p>
+    <w:p>
+      <w:pPr>
+        <w:spacing w:after="200"/>
+        <w:jc w:val="center"/>
+      </w:pPr>
+    </w:p>
+    <w:p>
+      <w:pPr>
+        <w:spacing w:after="200"/>
+        <w:jc w:val="center"/>
+      </w:pPr>
+    </w:p>
+    <w:p>
+      <w:pPr>
         <w:pStyle w:val="Heading2"/>
         <w:spacing w:before="300" w:after="160"/>
         <w:rPr>
@@ -21404,20 +21382,12 @@
         <w:pStyle w:val="Heading2"/>
         <w:spacing w:before="300" w:after="160"/>
       </w:pPr>
-      <w:proofErr w:type="gramStart"/>
       <w:r>
         <w:rPr>
           <w:color w:val="1B4F72"/>
         </w:rPr>
         <w:lastRenderedPageBreak/>
-        <w:t>9.7  UC</w:t>
-      </w:r>
-      <w:proofErr w:type="gramEnd"/>
-      <w:r>
-        <w:rPr>
-          <w:color w:val="1B4F72"/>
-        </w:rPr>
-        <w:t>_A07: Record Payment</w:t>
+        <w:t>9.7  UC_A07: Record Payment</w:t>
       </w:r>
     </w:p>
     <w:p>
@@ -21446,7 +21416,7 @@
           <w:noProof/>
         </w:rPr>
         <w:drawing>
-          <wp:inline distT="0" distB="0" distL="0" distR="0" wp14:anchorId="464C27C1" wp14:editId="1D3ABF5A">
+          <wp:inline distT="0" distB="0" distL="0" distR="0" wp14:anchorId="0E235F6C" wp14:editId="7E107BE3">
             <wp:extent cx="5941060" cy="5447030"/>
             <wp:effectExtent l="0" t="0" r="2540" b="1270"/>
             <wp:docPr id="493059747" name="Picture 24"/>
@@ -21545,20 +21515,12 @@
         <w:pStyle w:val="Heading2"/>
         <w:spacing w:before="300" w:after="160"/>
       </w:pPr>
-      <w:proofErr w:type="gramStart"/>
       <w:r>
         <w:rPr>
           <w:color w:val="1B4F72"/>
         </w:rPr>
         <w:lastRenderedPageBreak/>
-        <w:t>9.8  UC</w:t>
-      </w:r>
-      <w:proofErr w:type="gramEnd"/>
-      <w:r>
-        <w:rPr>
-          <w:color w:val="1B4F72"/>
-        </w:rPr>
-        <w:t>_A08: Generate Reports</w:t>
+        <w:t>9.8  UC_A08: Generate Reports</w:t>
       </w:r>
     </w:p>
     <w:p>
@@ -21587,7 +21549,7 @@
           <w:noProof/>
         </w:rPr>
         <w:drawing>
-          <wp:inline distT="0" distB="0" distL="0" distR="0" wp14:anchorId="4F9AEDB2" wp14:editId="222AB047">
+          <wp:inline distT="0" distB="0" distL="0" distR="0" wp14:anchorId="596DA282" wp14:editId="5E00368F">
             <wp:extent cx="5931535" cy="5051425"/>
             <wp:effectExtent l="0" t="0" r="0" b="0"/>
             <wp:docPr id="1443210062" name="Picture 25"/>
@@ -21696,7 +21658,7 @@
           <w:noProof/>
         </w:rPr>
         <w:drawing>
-          <wp:inline distT="0" distB="0" distL="0" distR="0" wp14:anchorId="3674FE6D" wp14:editId="3633BC7C">
+          <wp:inline distT="0" distB="0" distL="0" distR="0" wp14:anchorId="4939E3EA" wp14:editId="4CE96B4A">
             <wp:extent cx="5932805" cy="4936490"/>
             <wp:effectExtent l="0" t="0" r="0" b="0"/>
             <wp:docPr id="1094045466" name="Picture 10"/>
@@ -21775,20 +21737,12 @@
         <w:pStyle w:val="Heading2"/>
         <w:spacing w:before="300" w:after="160"/>
       </w:pPr>
-      <w:proofErr w:type="gramStart"/>
       <w:r>
         <w:rPr>
           <w:color w:val="1B4F72"/>
         </w:rPr>
         <w:lastRenderedPageBreak/>
-        <w:t>10.2  UC</w:t>
-      </w:r>
-      <w:proofErr w:type="gramEnd"/>
-      <w:r>
-        <w:rPr>
-          <w:color w:val="1B4F72"/>
-        </w:rPr>
-        <w:t>_A02: Assign Room to Appointment</w:t>
+        <w:t>10.2  UC_A02: Assign Room to Appointment</w:t>
       </w:r>
     </w:p>
     <w:p>
@@ -21816,7 +21770,7 @@
           <w:noProof/>
         </w:rPr>
         <w:drawing>
-          <wp:inline distT="0" distB="0" distL="0" distR="0" wp14:anchorId="172EBEA4" wp14:editId="769466AC">
+          <wp:inline distT="0" distB="0" distL="0" distR="0" wp14:anchorId="31C5C336" wp14:editId="0ADEB37B">
             <wp:extent cx="5932805" cy="5660390"/>
             <wp:effectExtent l="0" t="0" r="0" b="0"/>
             <wp:docPr id="1606681561" name="Picture 11"/>
@@ -21900,20 +21854,12 @@
         <w:pStyle w:val="Heading2"/>
         <w:spacing w:before="300" w:after="160"/>
       </w:pPr>
-      <w:proofErr w:type="gramStart"/>
       <w:r>
         <w:rPr>
           <w:color w:val="1B4F72"/>
         </w:rPr>
         <w:lastRenderedPageBreak/>
-        <w:t>10.3  UC</w:t>
-      </w:r>
-      <w:proofErr w:type="gramEnd"/>
-      <w:r>
-        <w:rPr>
-          <w:color w:val="1B4F72"/>
-        </w:rPr>
-        <w:t>_A03: Generate Patient Bill</w:t>
+        <w:t>10.3  UC_A03: Generate Patient Bill</w:t>
       </w:r>
     </w:p>
     <w:p>
@@ -21941,7 +21887,7 @@
           <w:noProof/>
         </w:rPr>
         <w:drawing>
-          <wp:inline distT="0" distB="0" distL="0" distR="0" wp14:anchorId="7D9FE377" wp14:editId="62551F08">
+          <wp:inline distT="0" distB="0" distL="0" distR="0" wp14:anchorId="1C982664" wp14:editId="1405805B">
             <wp:extent cx="5932805" cy="6221095"/>
             <wp:effectExtent l="0" t="0" r="0" b="8255"/>
             <wp:docPr id="1625931044" name="Picture 12"/>
@@ -22015,20 +21961,12 @@
         <w:pStyle w:val="Heading2"/>
         <w:spacing w:before="300" w:after="160"/>
       </w:pPr>
-      <w:proofErr w:type="gramStart"/>
       <w:r>
         <w:rPr>
           <w:color w:val="1B4F72"/>
         </w:rPr>
         <w:lastRenderedPageBreak/>
-        <w:t>10.4  UC</w:t>
-      </w:r>
-      <w:proofErr w:type="gramEnd"/>
-      <w:r>
-        <w:rPr>
-          <w:color w:val="1B4F72"/>
-        </w:rPr>
-        <w:t>_A04: Manage Doctors (Add / Update / Deactivate)</w:t>
+        <w:t>10.4  UC_A04: Manage Doctors (Add / Update / Deactivate)</w:t>
       </w:r>
     </w:p>
     <w:p>
@@ -22056,7 +21994,7 @@
           <w:noProof/>
         </w:rPr>
         <w:drawing>
-          <wp:inline distT="0" distB="0" distL="0" distR="0" wp14:anchorId="10251B86" wp14:editId="707F6511">
+          <wp:inline distT="0" distB="0" distL="0" distR="0" wp14:anchorId="3219D51D" wp14:editId="241179E7">
             <wp:extent cx="5932805" cy="5715000"/>
             <wp:effectExtent l="0" t="0" r="0" b="0"/>
             <wp:docPr id="1430680808" name="Picture 13"/>
@@ -22140,20 +22078,12 @@
         <w:pStyle w:val="Heading2"/>
         <w:spacing w:before="300" w:after="160"/>
       </w:pPr>
-      <w:proofErr w:type="gramStart"/>
       <w:r>
         <w:rPr>
           <w:color w:val="1B4F72"/>
         </w:rPr>
         <w:lastRenderedPageBreak/>
-        <w:t>10.5  UC</w:t>
-      </w:r>
-      <w:proofErr w:type="gramEnd"/>
-      <w:r>
-        <w:rPr>
-          <w:color w:val="1B4F72"/>
-        </w:rPr>
-        <w:t>_A05: Manage Service Catalog and Prices</w:t>
+        <w:t>10.5  UC_A05: Manage Service Catalog and Prices</w:t>
       </w:r>
     </w:p>
     <w:p>
@@ -22181,7 +22111,7 @@
           <w:noProof/>
         </w:rPr>
         <w:drawing>
-          <wp:inline distT="0" distB="0" distL="0" distR="0" wp14:anchorId="5A453643" wp14:editId="002D9A26">
+          <wp:inline distT="0" distB="0" distL="0" distR="0" wp14:anchorId="4D7E4784" wp14:editId="008A806D">
             <wp:extent cx="5932805" cy="4250690"/>
             <wp:effectExtent l="0" t="0" r="0" b="0"/>
             <wp:docPr id="462231854" name="Picture 14"/>
@@ -22290,20 +22220,12 @@
         <w:pStyle w:val="Heading2"/>
         <w:spacing w:before="300" w:after="160"/>
       </w:pPr>
-      <w:proofErr w:type="gramStart"/>
       <w:r>
         <w:rPr>
           <w:color w:val="1B4F72"/>
         </w:rPr>
         <w:lastRenderedPageBreak/>
-        <w:t>10.6  UC</w:t>
-      </w:r>
-      <w:proofErr w:type="gramEnd"/>
-      <w:r>
-        <w:rPr>
-          <w:color w:val="1B4F72"/>
-        </w:rPr>
-        <w:t>_A06: Manage Appointment Schedules</w:t>
+        <w:t>10.6  UC_A06: Manage Appointment Schedules</w:t>
       </w:r>
     </w:p>
     <w:p>
@@ -22331,7 +22253,7 @@
           <w:noProof/>
         </w:rPr>
         <w:drawing>
-          <wp:inline distT="0" distB="0" distL="0" distR="0" wp14:anchorId="2D868975" wp14:editId="1BEA222B">
+          <wp:inline distT="0" distB="0" distL="0" distR="0" wp14:anchorId="5C6D9788" wp14:editId="735B369D">
             <wp:extent cx="5927090" cy="6221095"/>
             <wp:effectExtent l="0" t="0" r="0" b="8255"/>
             <wp:docPr id="840251894" name="Picture 15"/>
@@ -22405,20 +22327,12 @@
         <w:pStyle w:val="Heading2"/>
         <w:spacing w:before="300" w:after="160"/>
       </w:pPr>
-      <w:proofErr w:type="gramStart"/>
       <w:r>
         <w:rPr>
           <w:color w:val="1B4F72"/>
         </w:rPr>
         <w:lastRenderedPageBreak/>
-        <w:t>10.7  UC</w:t>
-      </w:r>
-      <w:proofErr w:type="gramEnd"/>
-      <w:r>
-        <w:rPr>
-          <w:color w:val="1B4F72"/>
-        </w:rPr>
-        <w:t>_A07: Record Payment</w:t>
+        <w:t>10.7  UC_A07: Record Payment</w:t>
       </w:r>
     </w:p>
     <w:p>
@@ -22446,7 +22360,7 @@
           <w:noProof/>
         </w:rPr>
         <w:drawing>
-          <wp:inline distT="0" distB="0" distL="0" distR="0" wp14:anchorId="5A242258" wp14:editId="6429352E">
+          <wp:inline distT="0" distB="0" distL="0" distR="0" wp14:anchorId="0D4B1428" wp14:editId="14510465">
             <wp:extent cx="5932805" cy="5192395"/>
             <wp:effectExtent l="0" t="0" r="0" b="8255"/>
             <wp:docPr id="1978375648" name="Picture 16"/>
@@ -22540,20 +22454,12 @@
         <w:pStyle w:val="Heading2"/>
         <w:spacing w:before="300" w:after="160"/>
       </w:pPr>
-      <w:proofErr w:type="gramStart"/>
       <w:r>
         <w:rPr>
           <w:color w:val="1B4F72"/>
         </w:rPr>
         <w:lastRenderedPageBreak/>
-        <w:t>10.8  UC</w:t>
-      </w:r>
-      <w:proofErr w:type="gramEnd"/>
-      <w:r>
-        <w:rPr>
-          <w:color w:val="1B4F72"/>
-        </w:rPr>
-        <w:t>_A08: Generate Reports</w:t>
+        <w:t>10.8  UC_A08: Generate Reports</w:t>
       </w:r>
     </w:p>
     <w:p>
@@ -22581,7 +22487,7 @@
           <w:noProof/>
         </w:rPr>
         <w:drawing>
-          <wp:inline distT="0" distB="0" distL="0" distR="0" wp14:anchorId="51D5E3D4" wp14:editId="5E00EA4B">
+          <wp:inline distT="0" distB="0" distL="0" distR="0" wp14:anchorId="03226392" wp14:editId="59529973">
             <wp:extent cx="5932805" cy="6591300"/>
             <wp:effectExtent l="0" t="0" r="0" b="0"/>
             <wp:docPr id="1278455602" name="Picture 17"/>
@@ -22630,9 +22536,1047 @@
         </w:drawing>
       </w:r>
     </w:p>
+    <w:p>
+      <w:r>
+        <w:br w:type="page"/>
+      </w:r>
+    </w:p>
+    <w:p>
+      <w:pPr>
+        <w:pStyle w:val="Heading1"/>
+      </w:pPr>
+      <w:r>
+        <w:rPr>
+          <w:color w:val="1B4F72"/>
+        </w:rPr>
+        <w:lastRenderedPageBreak/>
+        <w:t>11. State Diagrams</w:t>
+      </w:r>
+    </w:p>
+    <w:p>
+      <w:pPr>
+        <w:spacing w:after="200"/>
+      </w:pPr>
+      <w:r>
+        <w:t>This section contains the state diagrams for each entity managed by the administrator. Each diagram shows the lifecycle states, transitions, and entry/do/exit actions following UML state diagram notation.</w:t>
+      </w:r>
+    </w:p>
+    <w:p>
+      <w:pPr>
+        <w:pStyle w:val="Heading2"/>
+        <w:spacing w:before="300" w:after="160"/>
+      </w:pPr>
+      <w:r>
+        <w:rPr>
+          <w:color w:val="1B4F72"/>
+        </w:rPr>
+        <w:t>11.1  SD_Patient: Patient</w:t>
+      </w:r>
+    </w:p>
+    <w:p>
+      <w:pPr>
+        <w:jc w:val="center"/>
+      </w:pPr>
+      <w:r>
+        <w:rPr>
+          <w:noProof/>
+        </w:rPr>
+        <w:drawing>
+          <wp:inline distT="0" distB="0" distL="0" distR="0" wp14:anchorId="6F1C1FAB" wp14:editId="4F88D456">
+            <wp:extent cx="4692015" cy="4506595"/>
+            <wp:effectExtent l="0" t="0" r="0" b="8255"/>
+            <wp:docPr id="1129157644" name="Picture 3"/>
+            <wp:cNvGraphicFramePr>
+              <a:graphicFrameLocks xmlns:a="http://schemas.openxmlformats.org/drawingml/2006/main" noChangeAspect="1"/>
+            </wp:cNvGraphicFramePr>
+            <a:graphic xmlns:a="http://schemas.openxmlformats.org/drawingml/2006/main">
+              <a:graphicData uri="http://schemas.openxmlformats.org/drawingml/2006/picture">
+                <pic:pic xmlns:pic="http://schemas.openxmlformats.org/drawingml/2006/picture">
+                  <pic:nvPicPr>
+                    <pic:cNvPr id="0" name="Picture 5"/>
+                    <pic:cNvPicPr>
+                      <a:picLocks noChangeAspect="1" noChangeArrowheads="1"/>
+                    </pic:cNvPicPr>
+                  </pic:nvPicPr>
+                  <pic:blipFill>
+                    <a:blip r:embed="rId25">
+                      <a:extLst>
+                        <a:ext uri="{28A0092B-C50C-407E-A947-70E740481C1C}">
+                          <a14:useLocalDpi xmlns:a14="http://schemas.microsoft.com/office/drawing/2010/main" val="0"/>
+                        </a:ext>
+                      </a:extLst>
+                    </a:blip>
+                    <a:srcRect/>
+                    <a:stretch>
+                      <a:fillRect/>
+                    </a:stretch>
+                  </pic:blipFill>
+                  <pic:spPr bwMode="auto">
+                    <a:xfrm>
+                      <a:off x="0" y="0"/>
+                      <a:ext cx="4692015" cy="4506595"/>
+                    </a:xfrm>
+                    <a:prstGeom prst="rect">
+                      <a:avLst/>
+                    </a:prstGeom>
+                    <a:noFill/>
+                    <a:ln>
+                      <a:noFill/>
+                    </a:ln>
+                  </pic:spPr>
+                </pic:pic>
+              </a:graphicData>
+            </a:graphic>
+          </wp:inline>
+        </w:drawing>
+      </w:r>
+    </w:p>
+    <w:p>
+      <w:pPr>
+        <w:jc w:val="center"/>
+      </w:pPr>
+    </w:p>
+    <w:p>
+      <w:pPr>
+        <w:jc w:val="center"/>
+      </w:pPr>
+    </w:p>
+    <w:p>
+      <w:pPr>
+        <w:jc w:val="center"/>
+      </w:pPr>
+    </w:p>
+    <w:p>
+      <w:pPr>
+        <w:jc w:val="center"/>
+      </w:pPr>
+    </w:p>
+    <w:p>
+      <w:pPr>
+        <w:jc w:val="center"/>
+      </w:pPr>
+    </w:p>
+    <w:p>
+      <w:pPr>
+        <w:jc w:val="center"/>
+      </w:pPr>
+    </w:p>
+    <w:p>
+      <w:pPr>
+        <w:jc w:val="center"/>
+      </w:pPr>
+    </w:p>
+    <w:p>
+      <w:pPr>
+        <w:jc w:val="center"/>
+      </w:pPr>
+    </w:p>
+    <w:p>
+      <w:pPr>
+        <w:jc w:val="center"/>
+      </w:pPr>
+    </w:p>
+    <w:p>
+      <w:pPr>
+        <w:jc w:val="center"/>
+      </w:pPr>
+    </w:p>
+    <w:p>
+      <w:pPr>
+        <w:jc w:val="center"/>
+      </w:pPr>
+    </w:p>
+    <w:p>
+      <w:pPr>
+        <w:jc w:val="center"/>
+      </w:pPr>
+    </w:p>
+    <w:p>
+      <w:pPr>
+        <w:jc w:val="center"/>
+      </w:pPr>
+    </w:p>
+    <w:p>
+      <w:pPr>
+        <w:pStyle w:val="Heading2"/>
+        <w:spacing w:before="300" w:after="160"/>
+      </w:pPr>
+      <w:proofErr w:type="gramStart"/>
+      <w:r>
+        <w:rPr>
+          <w:color w:val="1B4F72"/>
+        </w:rPr>
+        <w:lastRenderedPageBreak/>
+        <w:t xml:space="preserve">11.2  </w:t>
+      </w:r>
+      <w:proofErr w:type="spellStart"/>
+      <w:r>
+        <w:rPr>
+          <w:color w:val="1B4F72"/>
+        </w:rPr>
+        <w:t>SD</w:t>
+      </w:r>
+      <w:proofErr w:type="gramEnd"/>
+      <w:r>
+        <w:rPr>
+          <w:color w:val="1B4F72"/>
+        </w:rPr>
+        <w:t>_Doctor</w:t>
+      </w:r>
+      <w:proofErr w:type="spellEnd"/>
+      <w:r>
+        <w:rPr>
+          <w:color w:val="1B4F72"/>
+        </w:rPr>
+        <w:t>: Doctor</w:t>
+      </w:r>
+    </w:p>
+    <w:p>
+      <w:pPr>
+        <w:jc w:val="center"/>
+      </w:pPr>
+      <w:r>
+        <w:rPr>
+          <w:noProof/>
+        </w:rPr>
+        <w:drawing>
+          <wp:inline distT="0" distB="0" distL="0" distR="0" wp14:anchorId="34D9556A" wp14:editId="75C7923E">
+            <wp:extent cx="5399405" cy="5965190"/>
+            <wp:effectExtent l="0" t="0" r="0" b="0"/>
+            <wp:docPr id="1985506406" name="Picture 4"/>
+            <wp:cNvGraphicFramePr>
+              <a:graphicFrameLocks xmlns:a="http://schemas.openxmlformats.org/drawingml/2006/main" noChangeAspect="1"/>
+            </wp:cNvGraphicFramePr>
+            <a:graphic xmlns:a="http://schemas.openxmlformats.org/drawingml/2006/main">
+              <a:graphicData uri="http://schemas.openxmlformats.org/drawingml/2006/picture">
+                <pic:pic xmlns:pic="http://schemas.openxmlformats.org/drawingml/2006/picture">
+                  <pic:nvPicPr>
+                    <pic:cNvPr id="0" name="Picture 7"/>
+                    <pic:cNvPicPr>
+                      <a:picLocks noChangeAspect="1" noChangeArrowheads="1"/>
+                    </pic:cNvPicPr>
+                  </pic:nvPicPr>
+                  <pic:blipFill>
+                    <a:blip r:embed="rId26">
+                      <a:extLst>
+                        <a:ext uri="{28A0092B-C50C-407E-A947-70E740481C1C}">
+                          <a14:useLocalDpi xmlns:a14="http://schemas.microsoft.com/office/drawing/2010/main" val="0"/>
+                        </a:ext>
+                      </a:extLst>
+                    </a:blip>
+                    <a:srcRect/>
+                    <a:stretch>
+                      <a:fillRect/>
+                    </a:stretch>
+                  </pic:blipFill>
+                  <pic:spPr bwMode="auto">
+                    <a:xfrm>
+                      <a:off x="0" y="0"/>
+                      <a:ext cx="5399405" cy="5965190"/>
+                    </a:xfrm>
+                    <a:prstGeom prst="rect">
+                      <a:avLst/>
+                    </a:prstGeom>
+                    <a:noFill/>
+                    <a:ln>
+                      <a:noFill/>
+                    </a:ln>
+                  </pic:spPr>
+                </pic:pic>
+              </a:graphicData>
+            </a:graphic>
+          </wp:inline>
+        </w:drawing>
+      </w:r>
+    </w:p>
+    <w:p>
+      <w:pPr>
+        <w:spacing w:after="200"/>
+      </w:pPr>
+    </w:p>
+    <w:p>
+      <w:pPr>
+        <w:spacing w:after="200"/>
+      </w:pPr>
+    </w:p>
+    <w:p>
+      <w:pPr>
+        <w:spacing w:after="200"/>
+      </w:pPr>
+    </w:p>
+    <w:p>
+      <w:pPr>
+        <w:spacing w:after="200"/>
+      </w:pPr>
+    </w:p>
+    <w:p>
+      <w:pPr>
+        <w:spacing w:after="200"/>
+      </w:pPr>
+    </w:p>
+    <w:p>
+      <w:pPr>
+        <w:spacing w:after="200"/>
+      </w:pPr>
+    </w:p>
+    <w:p>
+      <w:pPr>
+        <w:spacing w:after="200"/>
+      </w:pPr>
+    </w:p>
+    <w:p>
+      <w:pPr>
+        <w:spacing w:after="200"/>
+      </w:pPr>
+    </w:p>
+    <w:p>
+      <w:pPr>
+        <w:pStyle w:val="Heading2"/>
+        <w:spacing w:before="300" w:after="160"/>
+      </w:pPr>
+      <w:r>
+        <w:rPr>
+          <w:color w:val="1B4F72"/>
+        </w:rPr>
+        <w:t>11.3  SD_Appointment: Appointment</w:t>
+      </w:r>
+    </w:p>
+    <w:p>
+      <w:pPr>
+        <w:jc w:val="center"/>
+      </w:pPr>
+      <w:r>
+        <w:rPr>
+          <w:noProof/>
+        </w:rPr>
+        <w:drawing>
+          <wp:inline distT="0" distB="0" distL="0" distR="0" wp14:anchorId="2F50E8D5" wp14:editId="6CDAA639">
+            <wp:extent cx="5943600" cy="5340350"/>
+            <wp:effectExtent l="0" t="0" r="0" b="0"/>
+            <wp:docPr id="573967730" name="Picture 5"/>
+            <wp:cNvGraphicFramePr>
+              <a:graphicFrameLocks xmlns:a="http://schemas.openxmlformats.org/drawingml/2006/main" noChangeAspect="1"/>
+            </wp:cNvGraphicFramePr>
+            <a:graphic xmlns:a="http://schemas.openxmlformats.org/drawingml/2006/main">
+              <a:graphicData uri="http://schemas.openxmlformats.org/drawingml/2006/picture">
+                <pic:pic xmlns:pic="http://schemas.openxmlformats.org/drawingml/2006/picture">
+                  <pic:nvPicPr>
+                    <pic:cNvPr id="0" name="Picture 9"/>
+                    <pic:cNvPicPr>
+                      <a:picLocks noChangeAspect="1" noChangeArrowheads="1"/>
+                    </pic:cNvPicPr>
+                  </pic:nvPicPr>
+                  <pic:blipFill>
+                    <a:blip r:embed="rId27">
+                      <a:extLst>
+                        <a:ext uri="{28A0092B-C50C-407E-A947-70E740481C1C}">
+                          <a14:useLocalDpi xmlns:a14="http://schemas.microsoft.com/office/drawing/2010/main" val="0"/>
+                        </a:ext>
+                      </a:extLst>
+                    </a:blip>
+                    <a:srcRect/>
+                    <a:stretch>
+                      <a:fillRect/>
+                    </a:stretch>
+                  </pic:blipFill>
+                  <pic:spPr bwMode="auto">
+                    <a:xfrm>
+                      <a:off x="0" y="0"/>
+                      <a:ext cx="5943600" cy="5340350"/>
+                    </a:xfrm>
+                    <a:prstGeom prst="rect">
+                      <a:avLst/>
+                    </a:prstGeom>
+                    <a:noFill/>
+                    <a:ln>
+                      <a:noFill/>
+                    </a:ln>
+                  </pic:spPr>
+                </pic:pic>
+              </a:graphicData>
+            </a:graphic>
+          </wp:inline>
+        </w:drawing>
+      </w:r>
+    </w:p>
+    <w:p>
+      <w:pPr>
+        <w:jc w:val="center"/>
+      </w:pPr>
+    </w:p>
+    <w:p>
+      <w:pPr>
+        <w:jc w:val="center"/>
+      </w:pPr>
+    </w:p>
+    <w:p>
+      <w:pPr>
+        <w:jc w:val="center"/>
+      </w:pPr>
+    </w:p>
+    <w:p>
+      <w:pPr>
+        <w:jc w:val="center"/>
+      </w:pPr>
+    </w:p>
+    <w:p>
+      <w:pPr>
+        <w:jc w:val="center"/>
+      </w:pPr>
+    </w:p>
+    <w:p>
+      <w:pPr>
+        <w:jc w:val="center"/>
+      </w:pPr>
+    </w:p>
+    <w:p>
+      <w:pPr>
+        <w:jc w:val="center"/>
+      </w:pPr>
+    </w:p>
+    <w:p>
+      <w:pPr>
+        <w:jc w:val="center"/>
+      </w:pPr>
+    </w:p>
+    <w:p>
+      <w:pPr>
+        <w:jc w:val="center"/>
+      </w:pPr>
+    </w:p>
+    <w:p>
+      <w:pPr>
+        <w:jc w:val="center"/>
+      </w:pPr>
+    </w:p>
+    <w:p>
+      <w:pPr>
+        <w:jc w:val="center"/>
+      </w:pPr>
+    </w:p>
+    <w:p>
+      <w:pPr>
+        <w:jc w:val="center"/>
+      </w:pPr>
+    </w:p>
+    <w:p>
+      <w:pPr>
+        <w:jc w:val="center"/>
+      </w:pPr>
+    </w:p>
+    <w:p>
+      <w:pPr>
+        <w:jc w:val="center"/>
+      </w:pPr>
+    </w:p>
+    <w:p>
+      <w:pPr>
+        <w:jc w:val="center"/>
+      </w:pPr>
+    </w:p>
+    <w:p>
+      <w:pPr>
+        <w:jc w:val="center"/>
+      </w:pPr>
+    </w:p>
+    <w:p>
+      <w:pPr>
+        <w:jc w:val="center"/>
+      </w:pPr>
+    </w:p>
+    <w:p>
+      <w:pPr>
+        <w:jc w:val="center"/>
+      </w:pPr>
+    </w:p>
+    <w:p>
+      <w:pPr>
+        <w:spacing w:after="200"/>
+      </w:pPr>
+    </w:p>
+    <w:p>
+      <w:pPr>
+        <w:pStyle w:val="Heading2"/>
+        <w:spacing w:before="300" w:after="160"/>
+      </w:pPr>
+      <w:r>
+        <w:rPr>
+          <w:color w:val="1B4F72"/>
+        </w:rPr>
+        <w:t>11.4  SD_Room: Room</w:t>
+      </w:r>
+    </w:p>
+    <w:p>
+      <w:pPr>
+        <w:jc w:val="center"/>
+      </w:pPr>
+      <w:r>
+        <w:rPr>
+          <w:noProof/>
+        </w:rPr>
+        <w:drawing>
+          <wp:inline distT="0" distB="0" distL="0" distR="0" wp14:anchorId="0C07B92D" wp14:editId="3FAE8A18">
+            <wp:extent cx="5943600" cy="3698875"/>
+            <wp:effectExtent l="0" t="0" r="0" b="0"/>
+            <wp:docPr id="549050367" name="Picture 6"/>
+            <wp:cNvGraphicFramePr>
+              <a:graphicFrameLocks xmlns:a="http://schemas.openxmlformats.org/drawingml/2006/main" noChangeAspect="1"/>
+            </wp:cNvGraphicFramePr>
+            <a:graphic xmlns:a="http://schemas.openxmlformats.org/drawingml/2006/main">
+              <a:graphicData uri="http://schemas.openxmlformats.org/drawingml/2006/picture">
+                <pic:pic xmlns:pic="http://schemas.openxmlformats.org/drawingml/2006/picture">
+                  <pic:nvPicPr>
+                    <pic:cNvPr id="0" name="Picture 11"/>
+                    <pic:cNvPicPr>
+                      <a:picLocks noChangeAspect="1" noChangeArrowheads="1"/>
+                    </pic:cNvPicPr>
+                  </pic:nvPicPr>
+                  <pic:blipFill>
+                    <a:blip r:embed="rId28">
+                      <a:extLst>
+                        <a:ext uri="{28A0092B-C50C-407E-A947-70E740481C1C}">
+                          <a14:useLocalDpi xmlns:a14="http://schemas.microsoft.com/office/drawing/2010/main" val="0"/>
+                        </a:ext>
+                      </a:extLst>
+                    </a:blip>
+                    <a:srcRect/>
+                    <a:stretch>
+                      <a:fillRect/>
+                    </a:stretch>
+                  </pic:blipFill>
+                  <pic:spPr bwMode="auto">
+                    <a:xfrm>
+                      <a:off x="0" y="0"/>
+                      <a:ext cx="5943600" cy="3698875"/>
+                    </a:xfrm>
+                    <a:prstGeom prst="rect">
+                      <a:avLst/>
+                    </a:prstGeom>
+                    <a:noFill/>
+                    <a:ln>
+                      <a:noFill/>
+                    </a:ln>
+                  </pic:spPr>
+                </pic:pic>
+              </a:graphicData>
+            </a:graphic>
+          </wp:inline>
+        </w:drawing>
+      </w:r>
+    </w:p>
+    <w:p>
+      <w:pPr>
+        <w:jc w:val="center"/>
+      </w:pPr>
+    </w:p>
+    <w:p>
+      <w:pPr>
+        <w:jc w:val="center"/>
+      </w:pPr>
+    </w:p>
+    <w:p>
+      <w:pPr>
+        <w:jc w:val="center"/>
+      </w:pPr>
+    </w:p>
+    <w:p>
+      <w:pPr>
+        <w:jc w:val="center"/>
+      </w:pPr>
+    </w:p>
+    <w:p>
+      <w:pPr>
+        <w:jc w:val="center"/>
+      </w:pPr>
+    </w:p>
+    <w:p>
+      <w:pPr>
+        <w:jc w:val="center"/>
+      </w:pPr>
+    </w:p>
+    <w:p>
+      <w:pPr>
+        <w:jc w:val="center"/>
+      </w:pPr>
+    </w:p>
+    <w:p>
+      <w:pPr>
+        <w:jc w:val="center"/>
+      </w:pPr>
+    </w:p>
+    <w:p>
+      <w:pPr>
+        <w:jc w:val="center"/>
+      </w:pPr>
+    </w:p>
+    <w:p>
+      <w:pPr>
+        <w:jc w:val="center"/>
+      </w:pPr>
+    </w:p>
+    <w:p>
+      <w:pPr>
+        <w:jc w:val="center"/>
+      </w:pPr>
+    </w:p>
+    <w:p>
+      <w:pPr>
+        <w:jc w:val="center"/>
+      </w:pPr>
+    </w:p>
+    <w:p>
+      <w:pPr>
+        <w:jc w:val="center"/>
+      </w:pPr>
+    </w:p>
+    <w:p>
+      <w:pPr>
+        <w:jc w:val="center"/>
+      </w:pPr>
+    </w:p>
+    <w:p>
+      <w:pPr>
+        <w:jc w:val="center"/>
+      </w:pPr>
+    </w:p>
+    <w:p>
+      <w:pPr>
+        <w:jc w:val="center"/>
+      </w:pPr>
+    </w:p>
+    <w:p>
+      <w:pPr>
+        <w:jc w:val="center"/>
+      </w:pPr>
+    </w:p>
+    <w:p>
+      <w:pPr>
+        <w:spacing w:after="200"/>
+      </w:pPr>
+    </w:p>
+    <w:p>
+      <w:pPr>
+        <w:pStyle w:val="Heading2"/>
+        <w:spacing w:before="300" w:after="160"/>
+      </w:pPr>
+      <w:r>
+        <w:rPr>
+          <w:color w:val="1B4F72"/>
+        </w:rPr>
+        <w:lastRenderedPageBreak/>
+        <w:t>11.5  SD_Invoice: Invoice</w:t>
+      </w:r>
+    </w:p>
+    <w:p>
+      <w:pPr>
+        <w:jc w:val="center"/>
+      </w:pPr>
+      <w:r>
+        <w:rPr>
+          <w:noProof/>
+        </w:rPr>
+        <w:drawing>
+          <wp:inline distT="0" distB="0" distL="0" distR="0" wp14:anchorId="34A174B6" wp14:editId="0AAADA5A">
+            <wp:extent cx="4920615" cy="6542405"/>
+            <wp:effectExtent l="0" t="0" r="0" b="0"/>
+            <wp:docPr id="1810230323" name="Picture 7"/>
+            <wp:cNvGraphicFramePr>
+              <a:graphicFrameLocks xmlns:a="http://schemas.openxmlformats.org/drawingml/2006/main" noChangeAspect="1"/>
+            </wp:cNvGraphicFramePr>
+            <a:graphic xmlns:a="http://schemas.openxmlformats.org/drawingml/2006/main">
+              <a:graphicData uri="http://schemas.openxmlformats.org/drawingml/2006/picture">
+                <pic:pic xmlns:pic="http://schemas.openxmlformats.org/drawingml/2006/picture">
+                  <pic:nvPicPr>
+                    <pic:cNvPr id="0" name="Picture 13"/>
+                    <pic:cNvPicPr>
+                      <a:picLocks noChangeAspect="1" noChangeArrowheads="1"/>
+                    </pic:cNvPicPr>
+                  </pic:nvPicPr>
+                  <pic:blipFill>
+                    <a:blip r:embed="rId29">
+                      <a:extLst>
+                        <a:ext uri="{28A0092B-C50C-407E-A947-70E740481C1C}">
+                          <a14:useLocalDpi xmlns:a14="http://schemas.microsoft.com/office/drawing/2010/main" val="0"/>
+                        </a:ext>
+                      </a:extLst>
+                    </a:blip>
+                    <a:srcRect/>
+                    <a:stretch>
+                      <a:fillRect/>
+                    </a:stretch>
+                  </pic:blipFill>
+                  <pic:spPr bwMode="auto">
+                    <a:xfrm>
+                      <a:off x="0" y="0"/>
+                      <a:ext cx="4920615" cy="6542405"/>
+                    </a:xfrm>
+                    <a:prstGeom prst="rect">
+                      <a:avLst/>
+                    </a:prstGeom>
+                    <a:noFill/>
+                    <a:ln>
+                      <a:noFill/>
+                    </a:ln>
+                  </pic:spPr>
+                </pic:pic>
+              </a:graphicData>
+            </a:graphic>
+          </wp:inline>
+        </w:drawing>
+      </w:r>
+    </w:p>
+    <w:p>
+      <w:pPr>
+        <w:jc w:val="center"/>
+      </w:pPr>
+    </w:p>
+    <w:p>
+      <w:pPr>
+        <w:jc w:val="center"/>
+      </w:pPr>
+    </w:p>
+    <w:p>
+      <w:pPr>
+        <w:jc w:val="center"/>
+      </w:pPr>
+    </w:p>
+    <w:p>
+      <w:pPr>
+        <w:jc w:val="center"/>
+      </w:pPr>
+    </w:p>
+    <w:p>
+      <w:pPr>
+        <w:jc w:val="center"/>
+      </w:pPr>
+    </w:p>
+    <w:p>
+      <w:pPr>
+        <w:jc w:val="center"/>
+      </w:pPr>
+    </w:p>
+    <w:p>
+      <w:pPr>
+        <w:spacing w:after="200"/>
+      </w:pPr>
+    </w:p>
+    <w:p>
+      <w:pPr>
+        <w:pStyle w:val="Heading2"/>
+        <w:spacing w:before="300" w:after="160"/>
+      </w:pPr>
+      <w:r>
+        <w:rPr>
+          <w:color w:val="1B4F72"/>
+        </w:rPr>
+        <w:lastRenderedPageBreak/>
+        <w:t>11.6  SD_Payment: Payment</w:t>
+      </w:r>
+    </w:p>
+    <w:p>
+      <w:pPr>
+        <w:jc w:val="center"/>
+      </w:pPr>
+      <w:r>
+        <w:rPr>
+          <w:noProof/>
+        </w:rPr>
+        <w:drawing>
+          <wp:inline distT="0" distB="0" distL="0" distR="0" wp14:anchorId="38693A8E" wp14:editId="0765B311">
+            <wp:extent cx="3189605" cy="5965190"/>
+            <wp:effectExtent l="0" t="0" r="0" b="0"/>
+            <wp:docPr id="498332027" name="Picture 8"/>
+            <wp:cNvGraphicFramePr>
+              <a:graphicFrameLocks xmlns:a="http://schemas.openxmlformats.org/drawingml/2006/main" noChangeAspect="1"/>
+            </wp:cNvGraphicFramePr>
+            <a:graphic xmlns:a="http://schemas.openxmlformats.org/drawingml/2006/main">
+              <a:graphicData uri="http://schemas.openxmlformats.org/drawingml/2006/picture">
+                <pic:pic xmlns:pic="http://schemas.openxmlformats.org/drawingml/2006/picture">
+                  <pic:nvPicPr>
+                    <pic:cNvPr id="0" name="Picture 15"/>
+                    <pic:cNvPicPr>
+                      <a:picLocks noChangeAspect="1" noChangeArrowheads="1"/>
+                    </pic:cNvPicPr>
+                  </pic:nvPicPr>
+                  <pic:blipFill>
+                    <a:blip r:embed="rId30">
+                      <a:extLst>
+                        <a:ext uri="{28A0092B-C50C-407E-A947-70E740481C1C}">
+                          <a14:useLocalDpi xmlns:a14="http://schemas.microsoft.com/office/drawing/2010/main" val="0"/>
+                        </a:ext>
+                      </a:extLst>
+                    </a:blip>
+                    <a:srcRect/>
+                    <a:stretch>
+                      <a:fillRect/>
+                    </a:stretch>
+                  </pic:blipFill>
+                  <pic:spPr bwMode="auto">
+                    <a:xfrm>
+                      <a:off x="0" y="0"/>
+                      <a:ext cx="3189605" cy="5965190"/>
+                    </a:xfrm>
+                    <a:prstGeom prst="rect">
+                      <a:avLst/>
+                    </a:prstGeom>
+                    <a:noFill/>
+                    <a:ln>
+                      <a:noFill/>
+                    </a:ln>
+                  </pic:spPr>
+                </pic:pic>
+              </a:graphicData>
+            </a:graphic>
+          </wp:inline>
+        </w:drawing>
+      </w:r>
+    </w:p>
+    <w:p>
+      <w:pPr>
+        <w:spacing w:after="200"/>
+      </w:pPr>
+    </w:p>
+    <w:p>
+      <w:pPr>
+        <w:spacing w:after="200"/>
+      </w:pPr>
+    </w:p>
+    <w:p>
+      <w:pPr>
+        <w:spacing w:after="200"/>
+      </w:pPr>
+    </w:p>
+    <w:p>
+      <w:pPr>
+        <w:spacing w:after="200"/>
+      </w:pPr>
+    </w:p>
+    <w:p>
+      <w:pPr>
+        <w:spacing w:after="200"/>
+      </w:pPr>
+    </w:p>
+    <w:p>
+      <w:pPr>
+        <w:spacing w:after="200"/>
+      </w:pPr>
+    </w:p>
+    <w:p>
+      <w:pPr>
+        <w:pStyle w:val="Heading2"/>
+        <w:spacing w:before="300" w:after="160"/>
+      </w:pPr>
+      <w:r>
+        <w:rPr>
+          <w:color w:val="1B4F72"/>
+        </w:rPr>
+        <w:lastRenderedPageBreak/>
+        <w:t>11.7  SD_ClinicService: Clinic Service</w:t>
+      </w:r>
+    </w:p>
+    <w:p>
+      <w:pPr>
+        <w:jc w:val="center"/>
+      </w:pPr>
+      <w:r>
+        <w:rPr>
+          <w:noProof/>
+        </w:rPr>
+        <w:drawing>
+          <wp:inline distT="0" distB="0" distL="0" distR="0" wp14:anchorId="5D9F282F" wp14:editId="18202916">
+            <wp:extent cx="5230229" cy="5595257"/>
+            <wp:effectExtent l="0" t="0" r="8890" b="5715"/>
+            <wp:docPr id="132591214" name="Picture 9"/>
+            <wp:cNvGraphicFramePr>
+              <a:graphicFrameLocks xmlns:a="http://schemas.openxmlformats.org/drawingml/2006/main" noChangeAspect="1"/>
+            </wp:cNvGraphicFramePr>
+            <a:graphic xmlns:a="http://schemas.openxmlformats.org/drawingml/2006/main">
+              <a:graphicData uri="http://schemas.openxmlformats.org/drawingml/2006/picture">
+                <pic:pic xmlns:pic="http://schemas.openxmlformats.org/drawingml/2006/picture">
+                  <pic:nvPicPr>
+                    <pic:cNvPr id="0" name="Picture 17"/>
+                    <pic:cNvPicPr>
+                      <a:picLocks noChangeAspect="1" noChangeArrowheads="1"/>
+                    </pic:cNvPicPr>
+                  </pic:nvPicPr>
+                  <pic:blipFill>
+                    <a:blip r:embed="rId31">
+                      <a:extLst>
+                        <a:ext uri="{28A0092B-C50C-407E-A947-70E740481C1C}">
+                          <a14:useLocalDpi xmlns:a14="http://schemas.microsoft.com/office/drawing/2010/main" val="0"/>
+                        </a:ext>
+                      </a:extLst>
+                    </a:blip>
+                    <a:srcRect/>
+                    <a:stretch>
+                      <a:fillRect/>
+                    </a:stretch>
+                  </pic:blipFill>
+                  <pic:spPr bwMode="auto">
+                    <a:xfrm>
+                      <a:off x="0" y="0"/>
+                      <a:ext cx="5235035" cy="5600399"/>
+                    </a:xfrm>
+                    <a:prstGeom prst="rect">
+                      <a:avLst/>
+                    </a:prstGeom>
+                    <a:noFill/>
+                    <a:ln>
+                      <a:noFill/>
+                    </a:ln>
+                  </pic:spPr>
+                </pic:pic>
+              </a:graphicData>
+            </a:graphic>
+          </wp:inline>
+        </w:drawing>
+      </w:r>
+    </w:p>
+    <w:p>
+      <w:pPr>
+        <w:spacing w:after="200"/>
+      </w:pPr>
+    </w:p>
+    <w:p>
+      <w:pPr>
+        <w:spacing w:after="200"/>
+      </w:pPr>
+    </w:p>
+    <w:p>
+      <w:pPr>
+        <w:spacing w:after="200"/>
+      </w:pPr>
+    </w:p>
+    <w:p>
+      <w:pPr>
+        <w:spacing w:after="200"/>
+      </w:pPr>
+    </w:p>
+    <w:p>
+      <w:pPr>
+        <w:spacing w:after="200"/>
+      </w:pPr>
+    </w:p>
+    <w:p>
+      <w:pPr>
+        <w:spacing w:after="200"/>
+      </w:pPr>
+    </w:p>
+    <w:p>
+      <w:pPr>
+        <w:spacing w:after="200"/>
+      </w:pPr>
+    </w:p>
+    <w:p>
+      <w:pPr>
+        <w:pStyle w:val="Heading2"/>
+        <w:spacing w:before="300" w:after="160"/>
+        <w:rPr>
+          <w:color w:val="1B4F72"/>
+        </w:rPr>
+      </w:pPr>
+    </w:p>
+    <w:p>
+      <w:pPr>
+        <w:pStyle w:val="Heading2"/>
+        <w:spacing w:before="300" w:after="160"/>
+      </w:pPr>
+      <w:proofErr w:type="gramStart"/>
+      <w:r>
+        <w:rPr>
+          <w:color w:val="1B4F72"/>
+        </w:rPr>
+        <w:lastRenderedPageBreak/>
+        <w:t xml:space="preserve">11.8  </w:t>
+      </w:r>
+      <w:proofErr w:type="spellStart"/>
+      <w:r>
+        <w:rPr>
+          <w:color w:val="1B4F72"/>
+        </w:rPr>
+        <w:t>SD</w:t>
+      </w:r>
+      <w:proofErr w:type="gramEnd"/>
+      <w:r>
+        <w:rPr>
+          <w:color w:val="1B4F72"/>
+        </w:rPr>
+        <w:t>_AdminAccount</w:t>
+      </w:r>
+      <w:proofErr w:type="spellEnd"/>
+      <w:r>
+        <w:rPr>
+          <w:color w:val="1B4F72"/>
+        </w:rPr>
+        <w:t>: Admin Account</w:t>
+      </w:r>
+    </w:p>
+    <w:p>
+      <w:pPr>
+        <w:jc w:val="center"/>
+      </w:pPr>
+      <w:r>
+        <w:rPr>
+          <w:noProof/>
+        </w:rPr>
+        <w:drawing>
+          <wp:inline distT="0" distB="0" distL="0" distR="0" wp14:anchorId="5F2F517A" wp14:editId="063AFF84">
+            <wp:extent cx="5943600" cy="3785235"/>
+            <wp:effectExtent l="0" t="0" r="0" b="5715"/>
+            <wp:docPr id="634511485" name="Picture 10"/>
+            <wp:cNvGraphicFramePr>
+              <a:graphicFrameLocks xmlns:a="http://schemas.openxmlformats.org/drawingml/2006/main" noChangeAspect="1"/>
+            </wp:cNvGraphicFramePr>
+            <a:graphic xmlns:a="http://schemas.openxmlformats.org/drawingml/2006/main">
+              <a:graphicData uri="http://schemas.openxmlformats.org/drawingml/2006/picture">
+                <pic:pic xmlns:pic="http://schemas.openxmlformats.org/drawingml/2006/picture">
+                  <pic:nvPicPr>
+                    <pic:cNvPr id="0" name="Picture 19"/>
+                    <pic:cNvPicPr>
+                      <a:picLocks noChangeAspect="1" noChangeArrowheads="1"/>
+                    </pic:cNvPicPr>
+                  </pic:nvPicPr>
+                  <pic:blipFill>
+                    <a:blip r:embed="rId32">
+                      <a:extLst>
+                        <a:ext uri="{28A0092B-C50C-407E-A947-70E740481C1C}">
+                          <a14:useLocalDpi xmlns:a14="http://schemas.microsoft.com/office/drawing/2010/main" val="0"/>
+                        </a:ext>
+                      </a:extLst>
+                    </a:blip>
+                    <a:srcRect/>
+                    <a:stretch>
+                      <a:fillRect/>
+                    </a:stretch>
+                  </pic:blipFill>
+                  <pic:spPr bwMode="auto">
+                    <a:xfrm>
+                      <a:off x="0" y="0"/>
+                      <a:ext cx="5943600" cy="3785235"/>
+                    </a:xfrm>
+                    <a:prstGeom prst="rect">
+                      <a:avLst/>
+                    </a:prstGeom>
+                    <a:noFill/>
+                    <a:ln>
+                      <a:noFill/>
+                    </a:ln>
+                  </pic:spPr>
+                </pic:pic>
+              </a:graphicData>
+            </a:graphic>
+          </wp:inline>
+        </w:drawing>
+      </w:r>
+    </w:p>
+    <w:p>
+      <w:pPr>
+        <w:spacing w:after="200"/>
+      </w:pPr>
+    </w:p>
     <w:sectPr>
-      <w:headerReference w:type="default" r:id="rId25"/>
-      <w:footerReference w:type="default" r:id="rId26"/>
+      <w:headerReference w:type="default" r:id="rId33"/>
+      <w:footerReference w:type="default" r:id="rId34"/>
       <w:pgSz w:w="12240" w:h="15840"/>
       <w:pgMar w:top="1440" w:right="1440" w:bottom="1440" w:left="1440" w:header="708" w:footer="708" w:gutter="0"/>
       <w:cols w:space="720"/>

</xml_diff>